<commit_message>
Rebuild site: manual and wording updates
</commit_message>
<xml_diff>
--- a/en/files/sessions/s2_exercises.docx
+++ b/en/files/sessions/s2_exercises.docx
@@ -169,7 +169,7 @@
         <w:t xml:space="preserve">•  </w:t>
       </w:r>
       <w:r>
-        <w:t>Recap quiz on Session 1: on your own, in the online form linked in the chat (8 minutes, start of the session).</w:t>
+        <w:t>Recap quiz on Session 1: on your own, answers typed in the chat (8 minutes, start of the session).</w:t>
       </w:r>
     </w:p>
     <w:p>
@@ -282,7 +282,7 @@
         <w:pStyle w:val="Heading1"/>
       </w:pPr>
       <w:r>
-        <w:t>Recap quiz: Session 1  (individual, 8 minutes, in the online form)</w:t>
+        <w:t>Recap quiz: Session 1  (individual, 8 minutes, answers in the chat)</w:t>
       </w:r>
     </w:p>
     <w:p>

</xml_diff>